<commit_message>
Update credits: remove Dr. Melis (pending contact), fix Dr. Zhang attribution, add Dr. Jing Wang
</commit_message>
<xml_diff>
--- a/Parsers/FAST/FAST_Data_Structure_EN.docx
+++ b/Parsers/FAST/FAST_Data_Structure_EN.docx
@@ -39,35 +39,7 @@
           <w:i/>
           <w:iCs/>
         </w:rPr>
-        <w:t>Document version: 1.</w:t>
-      </w:r>
-      <w:r>
-        <w:rPr>
-          <w:i/>
-          <w:iCs/>
-        </w:rPr>
-        <w:t>1</w:t>
-      </w:r>
-      <w:r>
-        <w:rPr>
-          <w:i/>
-          <w:iCs/>
-        </w:rPr>
-        <w:t xml:space="preserve"> — </w:t>
-      </w:r>
-      <w:r>
-        <w:rPr>
-          <w:i/>
-          <w:iCs/>
-        </w:rPr>
-        <w:t>5 August</w:t>
-      </w:r>
-      <w:r>
-        <w:rPr>
-          <w:i/>
-          <w:iCs/>
-        </w:rPr>
-        <w:t xml:space="preserve"> 2026</w:t>
+        <w:t>Document version: 1.1 — 5 August 2026</w:t>
       </w:r>
     </w:p>
     <w:p>
@@ -813,6 +785,25 @@
       <w:r>
         <w:rPr/>
         <w:t>FRO format specification: fro_format_v17.py (~/FRO/FRO_System/).</w:t>
+      </w:r>
+    </w:p>
+    <w:p>
+      <w:pPr>
+        <w:pStyle w:val="Normal"/>
+        <w:rPr/>
+      </w:pPr>
+      <w:r>
+        <w:rPr/>
+      </w:r>
+    </w:p>
+    <w:p>
+      <w:pPr>
+        <w:pStyle w:val="Normal"/>
+        <w:rPr/>
+      </w:pPr>
+      <w:r>
+        <w:rPr/>
+        <w:t>Data use permission: Dr. Jing Wang (KIAA, Peking University) has explicitly granted permission to include the FEASTS NGC 628 data and derived products in the HALO pipeline and public repository (personal communication, August 2026).</w:t>
       </w:r>
     </w:p>
     <w:sectPr>
@@ -850,6 +841,7 @@
     <w:qFormat/>
     <w:pPr>
       <w:widowControl/>
+      <w:suppressAutoHyphens w:val="true"/>
       <w:bidi w:val="0"/>
       <w:spacing w:before="0" w:after="0"/>
       <w:jc w:val="start"/>
@@ -865,7 +857,7 @@
   </w:style>
   <w:style w:type="paragraph" w:styleId="Heading1">
     <w:name w:val="heading 1"/>
-    <w:basedOn w:val="Titolo"/>
+    <w:basedOn w:val="Titolouser"/>
     <w:qFormat/>
     <w:pPr/>
     <w:rPr>
@@ -876,7 +868,7 @@
   </w:style>
   <w:style w:type="paragraph" w:styleId="Heading2">
     <w:name w:val="heading 2"/>
-    <w:basedOn w:val="Titolo"/>
+    <w:basedOn w:val="Titolouser"/>
     <w:qFormat/>
     <w:pPr/>
     <w:rPr>
@@ -887,7 +879,7 @@
   </w:style>
   <w:style w:type="paragraph" w:styleId="Heading3">
     <w:name w:val="heading 3"/>
-    <w:basedOn w:val="Titolo"/>
+    <w:basedOn w:val="Titolouser"/>
     <w:qFormat/>
     <w:pPr/>
     <w:rPr>
@@ -898,7 +890,7 @@
   </w:style>
   <w:style w:type="paragraph" w:styleId="Heading4">
     <w:name w:val="heading 4"/>
-    <w:basedOn w:val="Titolo"/>
+    <w:basedOn w:val="Titolouser"/>
     <w:qFormat/>
     <w:pPr/>
     <w:rPr>
@@ -909,7 +901,7 @@
   </w:style>
   <w:style w:type="paragraph" w:styleId="Heading5">
     <w:name w:val="heading 5"/>
-    <w:basedOn w:val="Titolo"/>
+    <w:basedOn w:val="Titolouser"/>
     <w:qFormat/>
     <w:pPr/>
     <w:rPr>
@@ -918,7 +910,7 @@
   </w:style>
   <w:style w:type="paragraph" w:styleId="Heading6">
     <w:name w:val="heading 6"/>
-    <w:basedOn w:val="Titolo"/>
+    <w:basedOn w:val="Titolouser"/>
     <w:qFormat/>
     <w:pPr/>
     <w:rPr>
@@ -934,11 +926,18 @@
       <w:u w:val="single"/>
     </w:rPr>
   </w:style>
-  <w:style w:type="character" w:styleId="Caratterinotaapidipagina">
-    <w:name w:val="Caratteri nota a piè di pagina"/>
+  <w:style w:type="character" w:styleId="Caratterinotaapidipaginauser">
+    <w:name w:val="Caratteri nota a piè di pagina (user)"/>
     <w:uiPriority w:val="99"/>
     <w:semiHidden/>
     <w:unhideWhenUsed/>
+    <w:qFormat/>
+    <w:rPr>
+      <w:vertAlign w:val="superscript"/>
+    </w:rPr>
+  </w:style>
+  <w:style w:type="character" w:styleId="Caratterinotaapidipagina">
+    <w:name w:val="Caratteri nota a piè di pagina"/>
     <w:qFormat/>
     <w:rPr>
       <w:vertAlign w:val="superscript"/>
@@ -961,11 +960,18 @@
       <w:szCs w:val="20"/>
     </w:rPr>
   </w:style>
-  <w:style w:type="character" w:styleId="Caratterinotadichiusura">
-    <w:name w:val="Caratteri nota di chiusura"/>
+  <w:style w:type="character" w:styleId="Caratterinotadichiusurauser">
+    <w:name w:val="Caratteri nota di chiusura (user)"/>
     <w:uiPriority w:val="99"/>
     <w:semiHidden/>
     <w:unhideWhenUsed/>
+    <w:qFormat/>
+    <w:rPr>
+      <w:vertAlign w:val="superscript"/>
+    </w:rPr>
+  </w:style>
+  <w:style w:type="character" w:styleId="Caratterinotadichiusura">
+    <w:name w:val="Caratteri nota di chiusura"/>
     <w:qFormat/>
     <w:rPr>
       <w:vertAlign w:val="superscript"/>
@@ -1046,9 +1052,35 @@
       <w:rFonts w:cs="Noto Sans Devanagari"/>
     </w:rPr>
   </w:style>
+  <w:style w:type="paragraph" w:styleId="Titolouser">
+    <w:name w:val="Titolo (user)"/>
+    <w:basedOn w:val="Normal"/>
+    <w:next w:val="BodyText"/>
+    <w:qFormat/>
+    <w:pPr>
+      <w:keepNext w:val="true"/>
+      <w:spacing w:before="240" w:after="120"/>
+    </w:pPr>
+    <w:rPr>
+      <w:rFonts w:ascii="Liberation Sans" w:hAnsi="Liberation Sans" w:eastAsia="Noto Sans CJK SC" w:cs="Noto Sans Devanagari"/>
+      <w:sz w:val="28"/>
+      <w:szCs w:val="28"/>
+    </w:rPr>
+  </w:style>
+  <w:style w:type="paragraph" w:styleId="Indiceuser">
+    <w:name w:val="Indice (user)"/>
+    <w:basedOn w:val="Normal"/>
+    <w:qFormat/>
+    <w:pPr>
+      <w:suppressLineNumbers/>
+    </w:pPr>
+    <w:rPr>
+      <w:rFonts w:cs="Noto Sans Devanagari"/>
+    </w:rPr>
+  </w:style>
   <w:style w:type="paragraph" w:styleId="Title">
     <w:name w:val="Title"/>
-    <w:basedOn w:val="Titolo"/>
+    <w:basedOn w:val="Titolouser"/>
     <w:qFormat/>
     <w:pPr/>
     <w:rPr>
@@ -1061,6 +1093,7 @@
     <w:qFormat/>
     <w:pPr>
       <w:widowControl/>
+      <w:suppressAutoHyphens w:val="true"/>
       <w:bidi w:val="0"/>
       <w:spacing w:before="0" w:after="0"/>
       <w:jc w:val="start"/>
@@ -1081,6 +1114,7 @@
     <w:qFormat/>
     <w:pPr>
       <w:widowControl/>
+      <w:suppressAutoHyphens w:val="true"/>
       <w:bidi w:val="0"/>
       <w:spacing w:before="0" w:after="0"/>
       <w:jc w:val="start"/>

</xml_diff>